<commit_message>
Add cross-functional lifecycle swimlane
</commit_message>
<xml_diff>
--- a/outputs/2026-08-19_thailand-line-oa-plan/泰国_LINE-OA课前运营与销售分配实验方案_v1.0.docx
+++ b/outputs/2026-08-19_thailand-line-oa-plan/泰国_LINE-OA课前运营与销售分配实验方案_v1.0.docx
@@ -924,8 +924,8 @@
       <w:r>
         <w:drawing>
           <wp:inline xmlns:a="http://schemas.openxmlformats.org/drawingml/2006/main" xmlns:pic="http://schemas.openxmlformats.org/drawingml/2006/picture">
-            <wp:extent cx="5715000" cy="3878036"/>
-            <wp:docPr id="1" name="Picture 1" descr="图 1｜泰国 LINE-OA 从注册、关注补促到二约结束的主流程" title="图 1｜泰国 LINE-OA 从注册、关注补促到二约结束的主流程"/>
+            <wp:extent cx="5715000" cy="4675909"/>
+            <wp:docPr id="1" name="Picture 1" descr="图 1｜泰国 LINE-OA 跨部门泳道图：横向为部门，纵向为用户生命周期" title="图 1｜泰国 LINE-OA 跨部门泳道图：横向为部门，纵向为用户生命周期"/>
             <wp:cNvGraphicFramePr>
               <a:graphicFrameLocks noChangeAspect="1"/>
             </wp:cNvGraphicFramePr>
@@ -933,7 +933,7 @@
               <a:graphicData uri="http://schemas.openxmlformats.org/drawingml/2006/picture">
                 <pic:pic>
                   <pic:nvPicPr>
-                    <pic:cNvPr id="0" name="flow_main.png"/>
+                    <pic:cNvPr id="0" name="flow_swimlane.png"/>
                     <pic:cNvPicPr/>
                   </pic:nvPicPr>
                   <pic:blipFill>
@@ -945,7 +945,7 @@
                   <pic:spPr>
                     <a:xfrm>
                       <a:off x="0" y="0"/>
-                      <a:ext cx="5715000" cy="3878036"/>
+                      <a:ext cx="5715000" cy="4675909"/>
                     </a:xfrm>
                     <a:prstGeom prst="rect"/>
                   </pic:spPr>
@@ -969,7 +969,7 @@
           <w:color w:val="667085"/>
           <w:sz w:val="18"/>
         </w:rPr>
-        <w:t>图 1｜泰国 LINE-OA 从注册、关注补促到二约结束的主流程</w:t>
+        <w:t>图 1｜泰国 LINE-OA 跨部门泳道图：横向为部门，纵向为用户生命周期</w:t>
       </w:r>
     </w:p>
     <w:p>

</xml_diff>